<commit_message>
Add contact-confirmation.html page and screenshots"
</commit_message>
<xml_diff>
--- a/Module 8/Moffat_Bay_Module8_Marina_Functional_Test_Results_Alex_Peer_Updated.docx
+++ b/Module 8/Moffat_Bay_Module8_Marina_Functional_Test_Results_Alex_Peer_Updated.docx
@@ -151,8 +151,13 @@
             <w:tcW w:w="5112" w:type="dxa"/>
           </w:tcPr>
           <w:p>
-            <w:r>
-              <w:t>Aftabur Rahman / Green Team</w:t>
+            <w:proofErr w:type="spellStart"/>
+            <w:r>
+              <w:t>Aftabur</w:t>
+            </w:r>
+            <w:proofErr w:type="spellEnd"/>
+            <w:r>
+              <w:t xml:space="preserve"> Rahman / Green Team</w:t>
             </w:r>
           </w:p>
         </w:tc>
@@ -274,8 +279,13 @@
         </w:rPr>
         <w:t xml:space="preserve">Developer: </w:t>
       </w:r>
+      <w:proofErr w:type="spellStart"/>
       <w:r>
-        <w:t>Aftabur Rahman / Green Team</w:t>
+        <w:t>Aftabur</w:t>
+      </w:r>
+      <w:proofErr w:type="spellEnd"/>
+      <w:r>
+        <w:t xml:space="preserve"> Rahman / Green Team</w:t>
       </w:r>
     </w:p>
     <w:p>
@@ -915,8 +925,13 @@
         </w:rPr>
         <w:t xml:space="preserve">Developer: </w:t>
       </w:r>
+      <w:proofErr w:type="spellStart"/>
       <w:r>
-        <w:t>Aftabur Rahman / Green Team</w:t>
+        <w:t>Aftabur</w:t>
+      </w:r>
+      <w:proofErr w:type="spellEnd"/>
+      <w:r>
+        <w:t xml:space="preserve"> Rahman / Green Team</w:t>
       </w:r>
     </w:p>
     <w:p>
@@ -1711,8 +1726,13 @@
         </w:rPr>
         <w:t xml:space="preserve">Developer: </w:t>
       </w:r>
+      <w:proofErr w:type="spellStart"/>
       <w:r>
-        <w:t>Aftabur Rahman / Green Team</w:t>
+        <w:t>Aftabur</w:t>
+      </w:r>
+      <w:proofErr w:type="spellEnd"/>
+      <w:r>
+        <w:t xml:space="preserve"> Rahman / Green Team</w:t>
       </w:r>
     </w:p>
     <w:p>
@@ -1919,7 +1939,15 @@
           </w:p>
           <w:p>
             <w:r>
-              <w:t>Integrated with about us page as per clients request</w:t>
+              <w:t xml:space="preserve">Integrated with about us page as per </w:t>
+            </w:r>
+            <w:proofErr w:type="gramStart"/>
+            <w:r>
+              <w:t>clients</w:t>
+            </w:r>
+            <w:proofErr w:type="gramEnd"/>
+            <w:r>
+              <w:t xml:space="preserve"> request</w:t>
             </w:r>
           </w:p>
           <w:p>
@@ -2423,8 +2451,13 @@
         </w:rPr>
         <w:t xml:space="preserve">Developer: </w:t>
       </w:r>
+      <w:proofErr w:type="spellStart"/>
       <w:r>
-        <w:t>Aftabur Rahman / Green Team</w:t>
+        <w:t>Aftabur</w:t>
+      </w:r>
+      <w:proofErr w:type="spellEnd"/>
+      <w:r>
+        <w:t xml:space="preserve"> Rahman / Green Team</w:t>
       </w:r>
     </w:p>
     <w:p>
@@ -2468,11 +2501,11 @@
         <w:tblLook w:val="04A0" w:firstRow="1" w:lastRow="0" w:firstColumn="1" w:lastColumn="0" w:noHBand="0" w:noVBand="1"/>
       </w:tblPr>
       <w:tblGrid>
-        <w:gridCol w:w="1055"/>
-        <w:gridCol w:w="1480"/>
-        <w:gridCol w:w="1793"/>
-        <w:gridCol w:w="1374"/>
-        <w:gridCol w:w="4738"/>
+        <w:gridCol w:w="767"/>
+        <w:gridCol w:w="1315"/>
+        <w:gridCol w:w="1720"/>
+        <w:gridCol w:w="1178"/>
+        <w:gridCol w:w="5460"/>
       </w:tblGrid>
       <w:tr>
         <w:trPr>
@@ -2743,76 +2776,47 @@
               <w:t>YES</w:t>
             </w:r>
           </w:p>
-        </w:tc>
-      </w:tr>
-      <w:tr>
-        <w:trPr>
-          <w:jc w:val="center"/>
-        </w:trPr>
-        <w:tc>
-          <w:tcPr>
-            <w:tcW w:w="2045" w:type="dxa"/>
-            <w:vAlign w:val="center"/>
-          </w:tcPr>
+          <w:p/>
           <w:p>
             <w:r>
               <w:rPr>
-                <w:sz w:val="18"/>
+                <w:noProof/>
               </w:rPr>
-              <w:t>3</w:t>
-            </w:r>
-          </w:p>
-        </w:tc>
-        <w:tc>
-          <w:tcPr>
-            <w:tcW w:w="2045" w:type="dxa"/>
-            <w:vAlign w:val="center"/>
-          </w:tcPr>
-          <w:p>
-            <w:r>
-              <w:rPr>
-                <w:sz w:val="18"/>
-              </w:rPr>
-              <w:t>Observe the returned page.</w:t>
-            </w:r>
-          </w:p>
-        </w:tc>
-        <w:tc>
-          <w:tcPr>
-            <w:tcW w:w="2045" w:type="dxa"/>
-            <w:vAlign w:val="center"/>
-          </w:tcPr>
-          <w:p>
-            <w:r>
-              <w:rPr>
-                <w:sz w:val="18"/>
-              </w:rPr>
-              <w:t>The application redirects to contact-confirmation.html.</w:t>
-            </w:r>
-          </w:p>
-        </w:tc>
-        <w:tc>
-          <w:tcPr>
-            <w:tcW w:w="2045" w:type="dxa"/>
-            <w:vAlign w:val="center"/>
-          </w:tcPr>
-          <w:p>
-            <w:r>
-              <w:rPr>
-                <w:sz w:val="18"/>
-              </w:rPr>
-              <w:t>YES</w:t>
-            </w:r>
-          </w:p>
-        </w:tc>
-        <w:tc>
-          <w:tcPr>
-            <w:tcW w:w="2045" w:type="dxa"/>
-            <w:vAlign w:val="center"/>
-          </w:tcPr>
-          <w:p>
-            <w:r>
-              <w:t>YES</w:t>
+              <w:drawing>
+                <wp:inline distT="0" distB="0" distL="0" distR="0" wp14:anchorId="1A982AC7" wp14:editId="27B57728">
+                  <wp:extent cx="1866025" cy="2284894"/>
+                  <wp:effectExtent l="0" t="0" r="1270" b="1270"/>
+                  <wp:docPr id="1020713138" name="Picture 1"/>
+                  <wp:cNvGraphicFramePr>
+                    <a:graphicFrameLocks xmlns:a="http://schemas.openxmlformats.org/drawingml/2006/main" noChangeAspect="1"/>
+                  </wp:cNvGraphicFramePr>
+                  <a:graphic xmlns:a="http://schemas.openxmlformats.org/drawingml/2006/main">
+                    <a:graphicData uri="http://schemas.openxmlformats.org/drawingml/2006/picture">
+                      <pic:pic xmlns:pic="http://schemas.openxmlformats.org/drawingml/2006/picture">
+                        <pic:nvPicPr>
+                          <pic:cNvPr id="1020713138" name="Picture 1020713138"/>
+                          <pic:cNvPicPr/>
+                        </pic:nvPicPr>
+                        <pic:blipFill>
+                          <a:blip r:embed="rId22"/>
+                          <a:stretch>
+                            <a:fillRect/>
+                          </a:stretch>
+                        </pic:blipFill>
+                        <pic:spPr>
+                          <a:xfrm>
+                            <a:off x="0" y="0"/>
+                            <a:ext cx="1880527" cy="2302651"/>
+                          </a:xfrm>
+                          <a:prstGeom prst="rect">
+                            <a:avLst/>
+                          </a:prstGeom>
+                        </pic:spPr>
+                      </pic:pic>
+                    </a:graphicData>
+                  </a:graphic>
+                </wp:inline>
+              </w:drawing>
             </w:r>
           </w:p>
         </w:tc>
@@ -2831,6 +2835,122 @@
               <w:rPr>
                 <w:sz w:val="18"/>
               </w:rPr>
+              <w:t>3</w:t>
+            </w:r>
+          </w:p>
+        </w:tc>
+        <w:tc>
+          <w:tcPr>
+            <w:tcW w:w="2045" w:type="dxa"/>
+            <w:vAlign w:val="center"/>
+          </w:tcPr>
+          <w:p>
+            <w:r>
+              <w:rPr>
+                <w:sz w:val="18"/>
+              </w:rPr>
+              <w:t>Observe the returned page.</w:t>
+            </w:r>
+          </w:p>
+        </w:tc>
+        <w:tc>
+          <w:tcPr>
+            <w:tcW w:w="2045" w:type="dxa"/>
+            <w:vAlign w:val="center"/>
+          </w:tcPr>
+          <w:p>
+            <w:r>
+              <w:rPr>
+                <w:sz w:val="18"/>
+              </w:rPr>
+              <w:t>The application redirects to contact-confirmation.html.</w:t>
+            </w:r>
+          </w:p>
+        </w:tc>
+        <w:tc>
+          <w:tcPr>
+            <w:tcW w:w="2045" w:type="dxa"/>
+            <w:vAlign w:val="center"/>
+          </w:tcPr>
+          <w:p>
+            <w:r>
+              <w:rPr>
+                <w:sz w:val="18"/>
+              </w:rPr>
+              <w:t>YES</w:t>
+            </w:r>
+          </w:p>
+        </w:tc>
+        <w:tc>
+          <w:tcPr>
+            <w:tcW w:w="2045" w:type="dxa"/>
+            <w:vAlign w:val="center"/>
+          </w:tcPr>
+          <w:p>
+            <w:r>
+              <w:t>YES</w:t>
+            </w:r>
+          </w:p>
+          <w:p/>
+          <w:p>
+            <w:r>
+              <w:rPr>
+                <w:noProof/>
+              </w:rPr>
+              <w:drawing>
+                <wp:inline distT="0" distB="0" distL="0" distR="0" wp14:anchorId="7DA5D395" wp14:editId="01CD5EA5">
+                  <wp:extent cx="3329940" cy="612313"/>
+                  <wp:effectExtent l="0" t="0" r="0" b="0"/>
+                  <wp:docPr id="1420859875" name="Picture 2"/>
+                  <wp:cNvGraphicFramePr>
+                    <a:graphicFrameLocks xmlns:a="http://schemas.openxmlformats.org/drawingml/2006/main" noChangeAspect="1"/>
+                  </wp:cNvGraphicFramePr>
+                  <a:graphic xmlns:a="http://schemas.openxmlformats.org/drawingml/2006/main">
+                    <a:graphicData uri="http://schemas.openxmlformats.org/drawingml/2006/picture">
+                      <pic:pic xmlns:pic="http://schemas.openxmlformats.org/drawingml/2006/picture">
+                        <pic:nvPicPr>
+                          <pic:cNvPr id="1420859875" name="Picture 1420859875"/>
+                          <pic:cNvPicPr/>
+                        </pic:nvPicPr>
+                        <pic:blipFill>
+                          <a:blip r:embed="rId23"/>
+                          <a:stretch>
+                            <a:fillRect/>
+                          </a:stretch>
+                        </pic:blipFill>
+                        <pic:spPr>
+                          <a:xfrm>
+                            <a:off x="0" y="0"/>
+                            <a:ext cx="3392340" cy="623787"/>
+                          </a:xfrm>
+                          <a:prstGeom prst="rect">
+                            <a:avLst/>
+                          </a:prstGeom>
+                        </pic:spPr>
+                      </pic:pic>
+                    </a:graphicData>
+                  </a:graphic>
+                </wp:inline>
+              </w:drawing>
+            </w:r>
+          </w:p>
+        </w:tc>
+      </w:tr>
+      <w:tr>
+        <w:trPr>
+          <w:jc w:val="center"/>
+        </w:trPr>
+        <w:tc>
+          <w:tcPr>
+            <w:tcW w:w="2045" w:type="dxa"/>
+            <w:vAlign w:val="center"/>
+          </w:tcPr>
+          <w:p>
+            <w:r>
+              <w:rPr>
+                <w:sz w:val="18"/>
+              </w:rPr>
+              <w:lastRenderedPageBreak/>
               <w:t>4</w:t>
             </w:r>
           </w:p>
@@ -2908,7 +3028,7 @@
                           <pic:cNvPicPr/>
                         </pic:nvPicPr>
                         <pic:blipFill>
-                          <a:blip r:embed="rId22"/>
+                          <a:blip r:embed="rId24"/>
                           <a:stretch>
                             <a:fillRect/>
                           </a:stretch>
@@ -2952,7 +3072,6 @@
         <w:rPr>
           <w:noProof/>
         </w:rPr>
-        <w:lastRenderedPageBreak/>
         <w:drawing>
           <wp:inline distT="0" distB="0" distL="0" distR="0" wp14:anchorId="092C6218" wp14:editId="06BBF15D">
             <wp:extent cx="5852160" cy="3291840"/>
@@ -2969,7 +3088,7 @@
                     <pic:cNvPicPr/>
                   </pic:nvPicPr>
                   <pic:blipFill>
-                    <a:blip r:embed="rId23"/>
+                    <a:blip r:embed="rId25"/>
                     <a:stretch>
                       <a:fillRect/>
                     </a:stretch>

</xml_diff>